<commit_message>
Don't call the dictionary and questions unlimited: the app shows only talk time; safety caps go in the terms of use
Co-Authored-By: Claude Opus 5.5 <noreply@anthropic.com>
</commit_message>
<xml_diff>
--- a/docs/business-plan.docx
+++ b/docs/business-plan.docx
@@ -1233,7 +1233,7 @@
                 <w:sz w:val="19"/>
                 <w:szCs w:val="19"/>
               </w:rPr>
-              <w:t xml:space="preserve">「使い放題」（安全上限あり）</w:t>
+              <w:t xml:space="preserve">回数は表示しない（安全上限あり）</w:t>
             </w:r>
           </w:p>
         </w:tc>
@@ -1346,7 +1346,7 @@
                 <w:sz w:val="19"/>
                 <w:szCs w:val="19"/>
               </w:rPr>
-              <w:t xml:space="preserve">「使い放題」（安全上限あり）</w:t>
+              <w:t xml:space="preserve">回数は表示しない（安全上限あり）</w:t>
             </w:r>
           </w:p>
         </w:tc>
@@ -1589,7 +1589,7 @@
           <w:sz w:val="18"/>
           <w:szCs w:val="18"/>
         </w:rPr>
-        <w:t xml:space="preserve">※ 安全上限は不正利用を防ぐためのもので、アプリには表示しない。普通に洋書を読む人は届かない水準に設定。</w:t>
+        <w:t xml:space="preserve">※ 安全上限は不正利用を防ぐためのもので、アプリには表示しない。普通に洋書を読む人は届かない水準に設定。厳密には無制限ではないため「使い放題」とは表記せず、利用規約に「通常の利用を大きく超える場合は制限することがあります」と記載する。</w:t>
       </w:r>
     </w:p>
     <w:p>
@@ -6323,7 +6323,7 @@
         <w:rPr>
           <w:rFonts w:ascii="Arial" w:hAnsi="Arial" w:eastAsia="Yu Gothic" w:cs="Arial"/>
         </w:rPr>
-        <w:t xml:space="preserve">特定商取引法の表記・利用規約・プライバシーポリシー（社団法人名義）</w:t>
+        <w:t xml:space="preserve">特定商取引法の表記・利用規約・プライバシーポリシー（社団法人名義）。利用規約には、辞書・質問などの公正利用の上限についても記載</w:t>
       </w:r>
     </w:p>
     <w:p>

</xml_diff>